<commit_message>
Portal: popis portalu, uprava scenaru
</commit_message>
<xml_diff>
--- a/Sabi/scénáře_ke_třem_klíčovým_use_casům.docx
+++ b/Sabi/scénáře_ke_třem_klíčovým_use_casům.docx
@@ -933,143 +933,6 @@
         </w:pict>
       </w:r>
     </w:p>
-    <w:p>
-      <w:r>
-        <w:rPr>
-          <w:b/>
-          <w:bCs/>
-        </w:rPr>
-        <w:lastRenderedPageBreak/>
-        <w:t>Co si ohlídat s ostatními:</w:t>
-      </w:r>
-    </w:p>
-    <w:p>
-      <w:pPr>
-        <w:numPr>
-          <w:ilvl w:val="0"/>
-          <w:numId w:val="7"/>
-        </w:numPr>
-      </w:pPr>
-      <w:r>
-        <w:rPr>
-          <w:b/>
-          <w:bCs/>
-        </w:rPr>
-        <w:t>Eskalace ve scénáři 1</w:t>
-      </w:r>
-      <w:r>
-        <w:t xml:space="preserve"> musí odpovídat tvému stavovému diagramu </w:t>
-      </w:r>
-      <w:proofErr w:type="spellStart"/>
-      <w:r>
-        <w:t>alertu</w:t>
-      </w:r>
-      <w:proofErr w:type="spellEnd"/>
-      <w:r>
-        <w:t xml:space="preserve"> (#14). Stavy </w:t>
-      </w:r>
-      <w:r>
-        <w:rPr>
-          <w:i/>
-          <w:iCs/>
-        </w:rPr>
-        <w:t>Zobrazen</w:t>
-      </w:r>
-      <w:r>
-        <w:t xml:space="preserve">, </w:t>
-      </w:r>
-      <w:r>
-        <w:rPr>
-          <w:i/>
-          <w:iCs/>
-        </w:rPr>
-        <w:t>Řeší se</w:t>
-      </w:r>
-      <w:r>
-        <w:t xml:space="preserve">, </w:t>
-      </w:r>
-      <w:r>
-        <w:rPr>
-          <w:i/>
-          <w:iCs/>
-        </w:rPr>
-        <w:t>Vyřešen</w:t>
-      </w:r>
-      <w:r>
-        <w:t xml:space="preserve"> a </w:t>
-      </w:r>
-      <w:r>
-        <w:rPr>
-          <w:i/>
-          <w:iCs/>
-        </w:rPr>
-        <w:t>Eskalován</w:t>
-      </w:r>
-      <w:r>
-        <w:t xml:space="preserve"> používej v obou stejně.</w:t>
-      </w:r>
-    </w:p>
-    <w:p>
-      <w:pPr>
-        <w:numPr>
-          <w:ilvl w:val="0"/>
-          <w:numId w:val="7"/>
-        </w:numPr>
-      </w:pPr>
-      <w:r>
-        <w:rPr>
-          <w:b/>
-          <w:bCs/>
-        </w:rPr>
-        <w:t>Krok 7 ve scénáři 3</w:t>
-      </w:r>
-      <w:r>
-        <w:t xml:space="preserve"> (nová synchronizace s NIS) je zatím otevřená otázka č. 4 v tabulce pro roli 3. Pokud se rozhodnete jinak, uprav ho.</w:t>
-      </w:r>
-    </w:p>
-    <w:p>
-      <w:pPr>
-        <w:numPr>
-          <w:ilvl w:val="0"/>
-          <w:numId w:val="7"/>
-        </w:numPr>
-      </w:pPr>
-      <w:r>
-        <w:rPr>
-          <w:b/>
-          <w:bCs/>
-        </w:rPr>
-        <w:t>Každý krok má oporu v datech.</w:t>
-      </w:r>
-      <w:r>
-        <w:t xml:space="preserve"> Například „kdo vyřešil, kdy“ jsou sloupce </w:t>
-      </w:r>
-      <w:proofErr w:type="spellStart"/>
-      <w:r>
-        <w:t>resil_lekar_id</w:t>
-      </w:r>
-      <w:proofErr w:type="spellEnd"/>
-      <w:r>
-        <w:t xml:space="preserve"> a </w:t>
-      </w:r>
-      <w:proofErr w:type="spellStart"/>
-      <w:r>
-        <w:t>vyreseno</w:t>
-      </w:r>
-      <w:proofErr w:type="spellEnd"/>
-      <w:r>
-        <w:t xml:space="preserve"> v tabulce </w:t>
-      </w:r>
-      <w:proofErr w:type="spellStart"/>
-      <w:r>
-        <w:t>Alert</w:t>
-      </w:r>
-      <w:proofErr w:type="spellEnd"/>
-      <w:r>
-        <w:t>. Když tohle umíš propojit, zvládneš u obhajoby vysvětlit celý tok od obrazovky až do databáze.</w:t>
-      </w:r>
-    </w:p>
-    <w:p/>
     <w:sectPr>
       <w:pgSz w:w="11906" w:h="16838"/>
       <w:pgMar w:top="1417" w:right="1417" w:bottom="1417" w:left="1417" w:header="708" w:footer="708" w:gutter="0"/>

</xml_diff>